<commit_message>
Use Quokka's documented gate set: auto-translate circuits before sending
The Quokka docs list h, x, y, z, rx, ry, rz, cx, swap, cphase, U as supported
QASM gates. quokka_helper.to_quokka_gates() rewrites anything else (e.g. s, ccx
in the Task 2B half adder) and writes angles numerically; the local simulator
runs the same rewritten script. Report and maintenance guide updated.

Co-Authored-By: Claude Opus 5.5 <noreply@anthropic.com>
Claude-Session: https://claude.ai/code/session_01Cc7eGgMuZJii2jrx8znL2W
</commit_message>
<xml_diff>
--- a/Assignment_2_Quantum/Report/Assignment2.docx
+++ b/Assignment_2_Quantum/Report/Assignment2.docx
@@ -1017,7 +1017,7 @@
           <w:b/>
           <w:bCs/>
         </w:rPr>
-        <w:t xml:space="preserve">520 times faster</w:t>
+        <w:t xml:space="preserve">470 times faster</w:t>
       </w:r>
       <w:r>
         <w:t xml:space="preserve">, while linear classical models failed because the data is an XOR-type problem. The Quokka endpoint was offline when the results in this draft were produced (ERR_NGROK_3200), so these results come from a local simulator and are clearly labelled; one script re-runs everything on Quokka. Sources are cited in APA 7th style.</w:t>
@@ -1969,7 +1969,29 @@
         <w:t xml:space="preserve">emulator</w:t>
       </w:r>
       <w:r>
-        <w:t xml:space="preserve">: classical hardware that reproduces the behaviour of an ideal, fault-tolerant 30-qubit quantum computer (University of Technology Sydney [UTS], 2024). The course notebook reaches it with an HTTP request containing a QASM script and a shot count (Bahrami, 2026e). This matters for the analysis: because Quokka emulates an *error-free* machine, its results should match ideal theory except for random shot noise, unlike today's noisy hardware (Preskill, 2018).</w:t>
+        <w:t xml:space="preserve">: classical hardware that reproduces the behaviour of an ideal, fault-tolerant 30-qubit quantum computer (University of Technology Sydney [UTS], 2024). The course notebook and the official Quokka notebooks reach it with an HTTP request containing a QASM script and a shot count, </w:t>
+      </w:r>
+      <w:r>
+        <w:rPr>
+          <w:rFonts w:ascii="Consolas" w:cs="Consolas" w:eastAsia="Consolas" w:hAnsi="Consolas"/>
+          <w:sz w:val="19"/>
+          <w:szCs w:val="19"/>
+        </w:rPr>
+        <w:t xml:space="preserve">POST /qsim/qasm</w:t>
+      </w:r>
+      <w:r>
+        <w:t xml:space="preserve"> with </w:t>
+      </w:r>
+      <w:r>
+        <w:rPr>
+          <w:rFonts w:ascii="Consolas" w:cs="Consolas" w:eastAsia="Consolas" w:hAnsi="Consolas"/>
+          <w:sz w:val="19"/>
+          <w:szCs w:val="19"/>
+        </w:rPr>
+        <w:t xml:space="preserve">{"script": ..., "count": 1000}</w:t>
+      </w:r>
+      <w:r>
+        <w:t xml:space="preserve"> (Bahrami, 2026e; Quokka Computing, n.d.-a). The Quokka docs list the gates it accepts (h, x, y, z, rx, ry, rz, cx, swap, cphase, U), so our helper also rewrites any other gate into this set before sending (Quokka Computing, n.d.-b). This matters for the analysis: because Quokka emulates an *error-free* machine, its results should match ideal theory except for random shot noise, unlike today's noisy hardware (Preskill, 2018).</w:t>
       </w:r>
     </w:p>
     <w:p>
@@ -2078,7 +2100,7 @@
           <w:sz w:val="20"/>
           <w:szCs w:val="20"/>
         </w:rPr>
-        <w:t xml:space="preserve">Honesty note on the Quokka device. On 30–31 October 2026 the Quokka address replied: "endpoint quokka1.quokkacomputing.com is offline (ERR_NGROK_3200)". The helper therefore ran the identical QASM scripts on the Qiskit Aer simulator with a fixed seed, and every result in this draft is labelled LOCAL SIMULATOR in the notebooks and JSON files. Because Quokka itself emulates an ideal machine, the expected behaviour is the same, but these numbers are not Quokka data. Running run_all.bat when Quokka is online replaces them with device results and the label changes to QUOKKA DEVICE.</w:t>
+        <w:t xml:space="preserve">Honesty note on the Quokka device. On 30–31 October 2026 the Quokka address replied: "endpoint quokka1.quokkacomputing.com is offline (ERR_NGROK_3200)". Following the course guidance that simulator results are acceptable, the helper therefore ran the identical, Quokka-compatible QASM scripts on the Qiskit Aer simulator with a fixed seed, and every result in this draft is labelled LOCAL SIMULATOR in the notebooks and JSON files. Because Quokka itself emulates an ideal machine, the expected behaviour is the same, but these numbers are not Quokka data. Running run_all.bat when Quokka is online replaces them with device results and the label changes to QUOKKA DEVICE.</w:t>
       </w:r>
     </w:p>
     <w:p>
@@ -3501,7 +3523,7 @@
         <w:t xml:space="preserve">Runtime → Run all</w:t>
       </w:r>
       <w:r>
-        <w:t xml:space="preserve">. All four tasks finished without errors (Figure 3). Tasks 1–3 gave exactly the same counts as on the PC, because the local simulator uses a fixed seed. Task 4 took 160 s instead of about 90 s (0.99 s instead of 0.56 s per iteration), because Colab's free CPU is slower than the PC; the loss curve and accuracy were identical. A first attempt showed one portability problem: the notebooks were executed by a Jupyter kernel without Cirq installed. We fixed it by making </w:t>
+        <w:t xml:space="preserve">. All four tasks finished without errors (Figure 3). Tasks 1–3 gave exactly the same counts as on the PC, because the local simulator uses a fixed seed. Task 4 took 160 s instead of about 90 s (0.99 s instead of about 0.6 s per iteration), because Colab's free CPU is slower than the PC; the loss curve and accuracy were identical. A first attempt showed one portability problem: the notebooks were executed by a Jupyter kernel without Cirq installed. We fixed it by making </w:t>
       </w:r>
       <w:r>
         <w:rPr>
@@ -9962,7 +9984,7 @@
         <w:pStyle w:val="Heading2"/>
       </w:pPr>
       <w:r>
-        <w:t xml:space="preserve">4.7 What if the device does not support the Toffoli gate?</w:t>
+        <w:t xml:space="preserve">4.7 Can Quokka run every gate in our design?</w:t>
       </w:r>
     </w:p>
     <w:p>
@@ -9971,18 +9993,37 @@
         <w:jc w:val="both"/>
       </w:pPr>
       <w:r>
-        <w:t xml:space="preserve">Real devices only run a small native gate set, and a Toffoli must be decomposed into one- and two-qubit gates (Barenco et al., 1995). Our notebook builds an equivalent circuit from H, T, T†, S, Z and CX gates (8 CNOTs, 4 T and 3 T†). If Quokka rejects </w:t>
-      </w:r>
-      <w:r>
-        <w:rPr>
-          <w:rFonts w:ascii="Consolas" w:cs="Consolas" w:eastAsia="Consolas" w:hAnsi="Consolas"/>
-          <w:sz w:val="19"/>
-          <w:szCs w:val="19"/>
+        <w:t xml:space="preserve">No, and checking this was an important engineering step. The official *Quokka docs* notebook lists the QASM gates the Quokka simulator understands: </w:t>
+      </w:r>
+      <w:r>
+        <w:rPr>
+          <w:b/>
+          <w:bCs/>
+        </w:rPr>
+        <w:t xml:space="preserve">h, x, y, z, rx, ry, rz, cx, swap, cphase and U</w:t>
+      </w:r>
+      <w:r>
+        <w:t xml:space="preserve"> (Quokka Computing, n.d.-b). Our design uses </w:t>
+      </w:r>
+      <w:r>
+        <w:rPr>
+          <w:b/>
+          <w:bCs/>
+        </w:rPr>
+        <w:t xml:space="preserve">s</w:t>
+      </w:r>
+      <w:r>
+        <w:t xml:space="preserve"> and </w:t>
+      </w:r>
+      <w:r>
+        <w:rPr>
+          <w:b/>
+          <w:bCs/>
         </w:rPr>
         <w:t xml:space="preserve">ccx</w:t>
       </w:r>
       <w:r>
-        <w:t xml:space="preserve">, the notebook automatically sends this version. This also shows a real engineering cost: the 'one-line' Toffoli becomes about 15 basic gates, which on noisy hardware would add error.</w:t>
+        <w:t xml:space="preserve"> (Toffoli), which are not on the list, so the script as written would be rejected with error 7 (INVALID_QASM). Real quantum devices are the same: they run only a small native gate set, and a Toffoli must be decomposed into one- and two-qubit gates (Barenco et al., 1995). The shared helper therefore rewrites every circuit into Quokka's gate set before it is sent: S becomes RZ(π/2), and the Toffoli becomes 6 CNOT, 2 H and 7 RZ(±π/4) gates. The notebook proves that the rewritten circuit has exactly the same probabilities, and the local simulator runs the same rewritten script. The cost is visible: the one-line Toffoli became about 15 gates, and on noisy hardware every extra gate adds error.</w:t>
       </w:r>
     </w:p>
     <w:p>
@@ -15958,7 +15999,7 @@
         <w:t xml:space="preserve">constant</w:t>
       </w:r>
       <w:r>
-        <w:t xml:space="preserve"> time per iteration of 0.56 s on average (range 0.50–0.64 s). This is expected: every iteration runs the same number of circuits (6 for the update) with the same size and shot count, so the cost does not depend on how good the model is. The small spikes are background noise from the operating system. On the real Quokka, each circuit adds a network round trip, so the line would sit higher and be more irregular, and the total would be dominated by communication rather than computation.</w:t>
+        <w:t xml:space="preserve"> time per iteration of 0.61 s on average (range 0.51–0.72 s). This is expected: every iteration runs the same number of circuits (6 for the update) with the same size and shot count, so the cost does not depend on how good the model is. The small spikes are background noise from the operating system. On the real Quokka, each circuit adds a network round trip, so the line would sit higher and be more irregular, and the total would be dominated by communication rather than computation.</w:t>
       </w:r>
     </w:p>
     <w:p>
@@ -16396,7 +16437,7 @@
                 <w:sz w:val="18"/>
                 <w:szCs w:val="18"/>
               </w:rPr>
-              <w:t xml:space="preserve">84.6</w:t>
+              <w:t xml:space="preserve">91.7</w:t>
             </w:r>
           </w:p>
         </w:tc>
@@ -16425,7 +16466,7 @@
                 <w:sz w:val="18"/>
                 <w:szCs w:val="18"/>
               </w:rPr>
-              <w:t xml:space="preserve">0.563</w:t>
+              <w:t xml:space="preserve">0.614</w:t>
             </w:r>
           </w:p>
         </w:tc>
@@ -16603,7 +16644,7 @@
                 <w:sz w:val="18"/>
                 <w:szCs w:val="18"/>
               </w:rPr>
-              <w:t xml:space="preserve">0.16</w:t>
+              <w:t xml:space="preserve">0.19</w:t>
             </w:r>
           </w:p>
         </w:tc>
@@ -16633,7 +16674,7 @@
                 <w:sz w:val="18"/>
                 <w:szCs w:val="18"/>
               </w:rPr>
-              <w:t xml:space="preserve">0.0011</w:t>
+              <w:t xml:space="preserve">0.0013</w:t>
             </w:r>
           </w:p>
         </w:tc>
@@ -16813,7 +16854,7 @@
                 <w:sz w:val="18"/>
                 <w:szCs w:val="18"/>
               </w:rPr>
-              <w:t xml:space="preserve">0.007</w:t>
+              <w:t xml:space="preserve">0.024</w:t>
             </w:r>
           </w:p>
         </w:tc>
@@ -16842,7 +16883,7 @@
                 <w:sz w:val="18"/>
                 <w:szCs w:val="18"/>
               </w:rPr>
-              <w:t xml:space="preserve">0.00005</w:t>
+              <w:t xml:space="preserve">0.00016</w:t>
             </w:r>
           </w:p>
         </w:tc>
@@ -17273,10 +17314,10 @@
           <w:b/>
           <w:bCs/>
         </w:rPr>
-        <w:t xml:space="preserve">520 times faster</w:t>
-      </w:r>
-      <w:r>
-        <w:t xml:space="preserve"> (0.563 s → 0.0011 s). A shot-based run needs 1000 samples per circuit, plus QASM parsing and, on Quokka, a network request, whereas the exact simulation needs one small matrix calculation. Local-A and the quantum run followed almost the same loss curve, both first dropping below 0.05 at iteration 37. The shot noise therefore slowed the computer, not the learning. This advantage disappears as problems grow: exact simulation needs 2ⁿ amplitudes, so 50 qubits would need about 10¹⁵ complex numbers, which is why real quantum hardware becomes useful only at scale.</w:t>
+        <w:t xml:space="preserve">470 times faster</w:t>
+      </w:r>
+      <w:r>
+        <w:t xml:space="preserve"> (0.614 s → 0.0013 s). A shot-based run needs 1000 samples per circuit, plus QASM parsing and, on Quokka, a network request, whereas the exact simulation needs one small matrix calculation. Local-A and the quantum run followed almost the same loss curve, both first dropping below 0.05 at iteration 37. The shot noise therefore slowed the computer, not the learning. This advantage disappears as problems grow: exact simulation needs 2ⁿ amplitudes, so 50 qubits would need about 10¹⁵ complex numbers, which is why real quantum hardware becomes useful only at scale.</w:t>
       </w:r>
     </w:p>
     <w:p>
@@ -17531,7 +17572,7 @@
         <w:t xml:space="preserve">Monitoring:</w:t>
       </w:r>
       <w:r>
-        <w:t xml:space="preserve"> the loss fell from 0.50 to 0.00 in 100 iterations; time per iteration was flat at about 0.56 s.</w:t>
+        <w:t xml:space="preserve"> the loss fell from 0.50 to 0.00 in 100 iterations; time per iteration was flat at about 0.6 s.</w:t>
       </w:r>
     </w:p>
     <w:p>
@@ -17552,7 +17593,7 @@
         <w:t xml:space="preserve">Efficiency:</w:t>
       </w:r>
       <w:r>
-        <w:t xml:space="preserve"> at 4 qubits, simulation without the device is about 520 times faster; real devices only pay off where simulation is impossible.</w:t>
+        <w:t xml:space="preserve"> at 4 qubits, simulation without the device is about 470 times faster; real devices only pay off where simulation is impossible.</w:t>
       </w:r>
     </w:p>
     <w:p>
@@ -18209,7 +18250,7 @@
         <w:t xml:space="preserve">Task 4</w:t>
       </w:r>
       <w:r>
-        <w:t xml:space="preserve"> explained the data encoding and the tree-shaped circuit of a variational classifier, logged and plotted all 100 iterations, and compared the circuit with three local versions. The local versions were about 520 times faster, but only the circuit solved the XOR-shaped data. Across the project, the most important lesson was to </w:t>
+        <w:t xml:space="preserve"> explained the data encoding and the tree-shaped circuit of a variational classifier, logged and plotted all 100 iterations, and compared the circuit with three local versions. The local versions were about 470 times faster, but only the circuit solved the XOR-shaped data. Across the project, the most important lesson was to </w:t>
       </w:r>
       <w:r>
         <w:rPr>
@@ -18632,6 +18673,44 @@
       </w:r>
       <w:r>
         <w:t xml:space="preserve">, 79. https://doi.org/10.22331/q-2018-08-06-79</w:t>
+      </w:r>
+    </w:p>
+    <w:p>
+      <w:pPr>
+        <w:spacing w:after="120" w:line="276"/>
+        <w:ind w:left="720" w:hanging="720"/>
+      </w:pPr>
+      <w:r>
+        <w:t xml:space="preserve">Quokka Computing. (n.d.-a). </w:t>
+      </w:r>
+      <w:r>
+        <w:rPr>
+          <w:i/>
+          <w:iCs/>
+        </w:rPr>
+        <w:t xml:space="preserve">Quokka start here</w:t>
+      </w:r>
+      <w:r>
+        <w:t xml:space="preserve"> [Google Colab notebook]. Retrieved October 31, 2026, from https://colab.research.google.com/drive/17sM33S5XXjiew5Ss9U00ygOqLNSUUMOP</w:t>
+      </w:r>
+    </w:p>
+    <w:p>
+      <w:pPr>
+        <w:spacing w:after="120" w:line="276"/>
+        <w:ind w:left="720" w:hanging="720"/>
+      </w:pPr>
+      <w:r>
+        <w:t xml:space="preserve">Quokka Computing. (n.d.-b). </w:t>
+      </w:r>
+      <w:r>
+        <w:rPr>
+          <w:i/>
+          <w:iCs/>
+        </w:rPr>
+        <w:t xml:space="preserve">Quokka docs</w:t>
+      </w:r>
+      <w:r>
+        <w:t xml:space="preserve"> [Google Colab notebook]. Retrieved October 31, 2026, from https://colab.research.google.com/drive/1hRRnMnF9ivumrtVbku2dMlHtrRULpIav</w:t>
       </w:r>
     </w:p>
     <w:p>

</xml_diff>